<commit_message>
Agregar graficas comparativas de alto impacto (radar antes/despues y panel consolidado semestral)
</commit_message>
<xml_diff>
--- a/Informe_Monitoreo_Ciberseguridad_Segundo_Trimestre_2026.docx
+++ b/Informe_Monitoreo_Ciberseguridad_Segundo_Trimestre_2026.docx
@@ -2428,10 +2428,132 @@
     </w:p>
     <w:p>
       <w:pPr>
+        <w:jc w:val="both"/>
+      </w:pPr>
+      <w:r>
+        <w:t>La siguiente gráfica compara, control por control, el diagnóstico inicial recibido el 29 de mayo frente al estado verificado al cierre del 25 de junio. El área verde representa el fortalecimiento alcanzado durante el trimestre; el área roja discontinua muestra el punto de partida.</w:t>
+      </w:r>
+    </w:p>
+    <w:p>
+      <w:pPr>
+        <w:jc w:val="center"/>
+      </w:pPr>
+      <w:r>
+        <w:drawing>
+          <wp:inline xmlns:a="http://schemas.openxmlformats.org/drawingml/2006/main" xmlns:pic="http://schemas.openxmlformats.org/drawingml/2006/picture">
+            <wp:extent cx="6035040" cy="7321822"/>
+            <wp:docPr id="6" name="Picture 6"/>
+            <wp:cNvGraphicFramePr>
+              <a:graphicFrameLocks noChangeAspect="1"/>
+            </wp:cNvGraphicFramePr>
+            <a:graphic>
+              <a:graphicData uri="http://schemas.openxmlformats.org/drawingml/2006/picture">
+                <pic:pic>
+                  <pic:nvPicPr>
+                    <pic:cNvPr id="0" name="08_radar_antes_despues.png"/>
+                    <pic:cNvPicPr/>
+                  </pic:nvPicPr>
+                  <pic:blipFill>
+                    <a:blip r:embed="rId16"/>
+                    <a:stretch>
+                      <a:fillRect/>
+                    </a:stretch>
+                  </pic:blipFill>
+                  <pic:spPr>
+                    <a:xfrm>
+                      <a:off x="0" y="0"/>
+                      <a:ext cx="6035040" cy="7321822"/>
+                    </a:xfrm>
+                    <a:prstGeom prst="rect"/>
+                  </pic:spPr>
+                </pic:pic>
+              </a:graphicData>
+            </a:graphic>
+          </wp:inline>
+        </w:drawing>
+      </w:r>
+    </w:p>
+    <w:p>
+      <w:pPr>
+        <w:spacing w:after="160"/>
+        <w:jc w:val="center"/>
+      </w:pPr>
+      <w:r>
+        <w:rPr>
+          <w:i/>
+          <w:color w:val="595959"/>
+          <w:sz w:val="16"/>
+        </w:rPr>
+        <w:t>Gráfica 6. Fortalecimiento de controles técnicos: diagnóstico inicial frente al cierre del segundo trimestre.</w:t>
+      </w:r>
+    </w:p>
+    <w:p>
+      <w:pPr>
         <w:pStyle w:val="Heading1"/>
       </w:pPr>
       <w:r>
         <w:t>8. RESULTADOS DEL TRIMESTRE</w:t>
+      </w:r>
+    </w:p>
+    <w:p>
+      <w:pPr>
+        <w:jc w:val="both"/>
+      </w:pPr>
+      <w:r>
+        <w:t>El siguiente panel resume, de forma consolidada, la gestión de ciberseguridad realizada durante el primer semestre de 2026, período en el que se documentaron por primera vez estas prácticas en la entidad.</w:t>
+      </w:r>
+    </w:p>
+    <w:p>
+      <w:pPr>
+        <w:jc w:val="center"/>
+      </w:pPr>
+      <w:r>
+        <w:drawing>
+          <wp:inline xmlns:a="http://schemas.openxmlformats.org/drawingml/2006/main" xmlns:pic="http://schemas.openxmlformats.org/drawingml/2006/picture">
+            <wp:extent cx="6217920" cy="3981037"/>
+            <wp:docPr id="7" name="Picture 7"/>
+            <wp:cNvGraphicFramePr>
+              <a:graphicFrameLocks noChangeAspect="1"/>
+            </wp:cNvGraphicFramePr>
+            <a:graphic>
+              <a:graphicData uri="http://schemas.openxmlformats.org/drawingml/2006/picture">
+                <pic:pic>
+                  <pic:nvPicPr>
+                    <pic:cNvPr id="0" name="09_panel_indicadores_semestre.png"/>
+                    <pic:cNvPicPr/>
+                  </pic:nvPicPr>
+                  <pic:blipFill>
+                    <a:blip r:embed="rId17"/>
+                    <a:stretch>
+                      <a:fillRect/>
+                    </a:stretch>
+                  </pic:blipFill>
+                  <pic:spPr>
+                    <a:xfrm>
+                      <a:off x="0" y="0"/>
+                      <a:ext cx="6217920" cy="3981037"/>
+                    </a:xfrm>
+                    <a:prstGeom prst="rect"/>
+                  </pic:spPr>
+                </pic:pic>
+              </a:graphicData>
+            </a:graphic>
+          </wp:inline>
+        </w:drawing>
+      </w:r>
+    </w:p>
+    <w:p>
+      <w:pPr>
+        <w:spacing w:after="160"/>
+        <w:jc w:val="center"/>
+      </w:pPr>
+      <w:r>
+        <w:rPr>
+          <w:i/>
+          <w:color w:val="595959"/>
+          <w:sz w:val="16"/>
+        </w:rPr>
+        <w:t>Gráfica 7. Panorama consolidado de ciberseguridad – primer semestre de 2026.</w:t>
       </w:r>
     </w:p>
     <w:tbl>
@@ -2873,7 +2995,7 @@
         <w:drawing>
           <wp:inline xmlns:a="http://schemas.openxmlformats.org/drawingml/2006/main" xmlns:pic="http://schemas.openxmlformats.org/drawingml/2006/picture">
             <wp:extent cx="5669280" cy="3035678"/>
-            <wp:docPr id="6" name="Picture 6"/>
+            <wp:docPr id="8" name="Picture 8"/>
             <wp:cNvGraphicFramePr>
               <a:graphicFrameLocks noChangeAspect="1"/>
             </wp:cNvGraphicFramePr>
@@ -2885,7 +3007,7 @@
                     <pic:cNvPicPr/>
                   </pic:nvPicPr>
                   <pic:blipFill>
-                    <a:blip r:embed="rId16"/>
+                    <a:blip r:embed="rId18"/>
                     <a:stretch>
                       <a:fillRect/>
                     </a:stretch>
@@ -2915,7 +3037,7 @@
           <w:color w:val="595959"/>
           <w:sz w:val="16"/>
         </w:rPr>
-        <w:t>Gráfica 6. En 2025 no existían monitoreos formales documentados; en el primer semestre de 2026 se documentaron dos ejercicios relacionados y diferenciados.</w:t>
+        <w:t>Gráfica 8. En 2025 no existían monitoreos formales documentados; en el primer semestre de 2026 se documentaron dos ejercicios relacionados y diferenciados.</w:t>
       </w:r>
     </w:p>
     <w:tbl>

</xml_diff>